<commit_message>
docs: record phase 12.1 and 12.2 completion
</commit_message>
<xml_diff>
--- a/docs/roadmap/HIMP_PRODUCT_ROADMAP_PHASES_12-16_v1.0.0.docx
+++ b/docs/roadmap/HIMP_PRODUCT_ROADMAP_PHASES_12-16_v1.0.0.docx
@@ -380,7 +380,7 @@
     </w:p>
     <w:p>
       <w:r>
-        <w:t>Status: NEXT. Phase 12 turns HIMP's existing inventory, plugin health, host health, history, execution, and scheduler data into a more coherent operational view.</w:t>
+        <w:t>Status: IN PROGRESS. Phase 12.1 and Phase 12.2 are complete and production verified. The active implementation target is Phase 12.3 — Host Storage Capacity Intelligence. Phase 12 continues turning HIMP's existing inventory, plugin health, host health, history, execution, and scheduler data into a coherent operational view.</w:t>
       </w:r>
     </w:p>
     <w:p>
@@ -393,7 +393,7 @@
     </w:p>
     <w:p>
       <w:r>
-        <w:t>Define the canonical health contract; clarify the relationship between plugin health and infrastructure health; reduce contradictory presentation without rewriting the health system.</w:t>
+        <w:t>STATUS: COMPLETE / PRODUCTION VERIFIED. The canonical health-source contract now explicitly distinguishes Plugin Health (PLUGIN) from Host Connectivity (HOST_CONNECTIVITY). Health API, dashboard attention categories, host-health results, and normalized health cards use the clarified semantics. Validation completed with 859 passing tests, compileall PASS, git diff --check PASS, successful production deployment, clean runtime logs, and LOCAL == REMOTE == DEPLOYED at a6e9d66938a3f4007c62f5329a29f3f46afc4672.</w:t>
       </w:r>
     </w:p>
     <w:p>
@@ -406,7 +406,7 @@
     </w:p>
     <w:p>
       <w:r>
-        <w:t>Use the existing scheduler for configurable plugin-health refreshes, prevent overlap, record results, expose last/next refresh, and retain manual execution.</w:t>
+        <w:t>STATUS: COMPLETE / PRODUCTION VERIFIED. Plugin Health now uses the existing persisted scheduler with an enabled daily 04:00 refresh while retaining the manual automation path. Scheduler seed reconciliation preserves prior run history, and production exposes persisted last-run and calculated next-run state. Validation completed with 862 passing tests, compileall PASS, git diff --check PASS, successful production deployment, HIMP active, scheduler active/enabled, no live PostgreSQL pool warnings, explicit standalone pool cleanup PASS, and LOCAL == REMOTE == DEPLOYED at c491995c858c2d417cd5d25e09ae292d324222de.</w:t>
       </w:r>
     </w:p>
     <w:p>
@@ -751,7 +751,7 @@
     </w:p>
     <w:p>
       <w:r>
-        <w:t>Begin with Phase 12.1 — Health Model Consolidation. Before changing production code, confirm the current Git branch/status, deployed revision, HIMP service state, scheduler state, and the current health data/service/API paths. Keep the first implementation slice tightly bounded.</w:t>
+        <w:t>Proceed with Phase 12.3 — Host Storage Capacity Intelligence. Phase 12.1 and 12.2 are closed and production verified. Before changing production code, confirm the current Git branch/status, deployed revision, HIMP service state, scheduler state, and existing infrastructure/storage data paths. Keep the Phase 12.3 implementation slice tightly bounded around storage collection, persistence, thresholds, visual presentation, and alert-state generation.</w:t>
       </w:r>
     </w:p>
     <w:p>

</xml_diff>

<commit_message>
docs: record phase 12.3 production completion
</commit_message>
<xml_diff>
--- a/docs/roadmap/HIMP_PRODUCT_ROADMAP_PHASES_12-16_v1.0.0.docx
+++ b/docs/roadmap/HIMP_PRODUCT_ROADMAP_PHASES_12-16_v1.0.0.docx
@@ -380,7 +380,7 @@
     </w:p>
     <w:p>
       <w:r>
-        <w:t>Status: IN PROGRESS. Phase 12.1 and Phase 12.2 are complete and production verified. The active implementation target is Phase 12.3 — Host Storage Capacity Intelligence. Phase 12 continues turning HIMP's existing inventory, plugin health, host health, history, execution, and scheduler data into a coherent operational view.</w:t>
+        <w:t>Status: IN PROGRESS. Phase 12.1, 12.2, and 12.3 are complete and production verified. Phase 12 now provides clarified health-source semantics, scheduled daily plugin health, and host storage-capacity intelligence. Next target: Phase 12.4 — Infrastructure Relationships.</w:t>
       </w:r>
     </w:p>
     <w:p>
@@ -393,7 +393,7 @@
     </w:p>
     <w:p>
       <w:r>
-        <w:t>STATUS: COMPLETE / PRODUCTION VERIFIED. The canonical health-source contract now explicitly distinguishes Plugin Health (PLUGIN) from Host Connectivity (HOST_CONNECTIVITY). Health API, dashboard attention categories, host-health results, and normalized health cards use the clarified semantics. Validation completed with 859 passing tests, compileall PASS, git diff --check PASS, successful production deployment, clean runtime logs, and LOCAL == REMOTE == DEPLOYED at a6e9d66938a3f4007c62f5329a29f3f46afc4672.</w:t>
+        <w:t>Status: COMPLETE / PRODUCTION VERIFIED. Defined the canonical health contract and clarified plugin health versus host-connectivity semantics. Plugin Health and Host Connectivity now expose explicit source/label contracts, health-card normalization is consistent, and dashboard attention categories no longer conflate connectivity with general infrastructure health. Commit a6e9d66. Validation: 859 tests passed, compileall PASS, diff check PASS, deployed contract checks PASS.</w:t>
       </w:r>
     </w:p>
     <w:p>
@@ -406,7 +406,7 @@
     </w:p>
     <w:p>
       <w:r>
-        <w:t>STATUS: COMPLETE / PRODUCTION VERIFIED. Plugin Health now uses the existing persisted scheduler with an enabled daily 04:00 refresh while retaining the manual automation path. Scheduler seed reconciliation preserves prior run history, and production exposes persisted last-run and calculated next-run state. Validation completed with 862 passing tests, compileall PASS, git diff --check PASS, successful production deployment, HIMP active, scheduler active/enabled, no live PostgreSQL pool warnings, explicit standalone pool cleanup PASS, and LOCAL == REMOTE == DEPLOYED at c491995c858c2d417cd5d25e09ae292d324222de.</w:t>
+        <w:t>Status: COMPLETE / PRODUCTION VERIFIED. Plugin health is scheduled daily at 04:00 through the existing scheduler while retaining manual execution. Persisted scheduler reconciliation updates the schedule without losing execution history. Commit c491995. Validation: 862 tests passed, compileall PASS, diff check PASS, production schedule contract PASS, scheduler active/enabled, and PostgreSQL pools explicitly closed during standalone validation.</w:t>
       </w:r>
     </w:p>
     <w:p>
@@ -419,9 +419,16 @@
     </w:p>
     <w:p>
       <w:r>
-        <w:t>Collect and display per-host/per-filesystem capacity: mount point, total, used, free, percent used, and last checked. Add visual utilization bars, dashboard summary, host detail views, and an attention-required view. Default thresholds: WARNING &gt;=80%, CRITICAL &gt;=90%; thresholds must be configurable. Record alert state so repeated checks do not create duplicate alerts. Support state transitions NORMAL → WARNING → CRITICAL → RECOVERED.</w:t>
+        <w:t>Status: COMPLETE / PRODUCTION VERIFIED. Added host storage-capacity intelligence with per-host/per-filesystem collection, persistence, scheduler integration, API/application wiring, inventory and host-detail visualization, utilization bars, WARNING &gt;=80% and CRITICAL &gt;=90% thresholds, alert-event/state-transition support, and pseudo-filesystem filtering. Storage collection runs daily at 04:15 and remains manually executable. Initial implementation commit 31d680f; production numeric-width repair 2fb9198; per-filesystem Inventory UI refinement abe73b0. Production validation collected 65 filesystems across 44 hosts, including multi-terabyte network mounts; no pseudo filesystems were persisted. Final regression baseline: 875 tests passed; compileall, playbook syntax, Jinja parsing, and diff checks passed. Production release alignment confirmed LOCAL == REMOTE == DEPLOYED at abe73b0, HIMP active, scheduler active/enabled, and no recent service errors.</w:t>
       </w:r>
     </w:p>
+    <w:p>
+      <w:pPr/>
+      <w:r>
+        <w:t>Night checkpoint (2026-08-19): Phase 12.3 implementation, corrective production repair, per-filesystem UI refinement, regression, deployment, and deployed data-contract validation are complete. The browser visual acceptance screenshot was deferred at session close; no backend or deployment blocker remains. Repository was clean and synchronized at abe73b0.</w:t>
+      </w:r>
+    </w:p>
+    <CT_P/>
     <w:p>
       <w:pPr>
         <w:pStyle w:val="Heading2"/>
@@ -751,7 +758,7 @@
     </w:p>
     <w:p>
       <w:r>
-        <w:t>Proceed with Phase 12.3 — Host Storage Capacity Intelligence. Phase 12.1 and 12.2 are closed and production verified. Before changing production code, confirm the current Git branch/status, deployed revision, HIMP service state, scheduler state, and existing infrastructure/storage data paths. Keep the Phase 12.3 implementation slice tightly bounded around storage collection, persistence, thresholds, visual presentation, and alert-state generation.</w:t>
+        <w:t>Begin with Phase 12.1 — Health Model Consolidation. Before changing production code, confirm the current Git branch/status, deployed revision, HIMP service state, scheduler state, and the current health data/service/API paths. Keep the first implementation slice tightly bounded.</w:t>
       </w:r>
     </w:p>
     <w:p>

</xml_diff>